<commit_message>
fix(typography): enforce strict non-bold body styling matching reference template and prevent style inheritance in docx builder
</commit_message>
<xml_diff>
--- a/ngelaprak/templates/template_kampus.docx
+++ b/ngelaprak/templates/template_kampus.docx
@@ -674,7 +674,6 @@
     </w:p>
     <w:p>
       <w:pPr>
-        <w:pStyle w:val="Heading1"/>
         <w:tabs>
           <w:tab w:val="left" w:pos="840"/>
           <w:tab w:val="left" w:pos="841"/>
@@ -690,6 +689,7 @@
       </w:pPr>
       <w:r>
         <w:rPr>
+          <w:rFonts w:ascii="Times New Roman" w:hAnsi="Times New Roman"/>
           <w:b w:val="0"/>
           <w:bCs w:val="0"/>
           <w:sz w:val="24"/>
@@ -700,7 +700,6 @@
     </w:p>
     <w:p>
       <w:pPr>
-        <w:pStyle w:val="Heading1"/>
         <w:tabs>
           <w:tab w:val="left" w:pos="840"/>
           <w:tab w:val="left" w:pos="841"/>
@@ -716,6 +715,7 @@
       </w:pPr>
       <w:r>
         <w:rPr>
+          <w:rFonts w:ascii="Times New Roman" w:hAnsi="Times New Roman"/>
           <w:b w:val="0"/>
           <w:bCs w:val="0"/>
           <w:sz w:val="24"/>
@@ -726,7 +726,6 @@
     </w:p>
     <w:p>
       <w:pPr>
-        <w:pStyle w:val="Heading1"/>
         <w:tabs>
           <w:tab w:val="left" w:pos="840"/>
           <w:tab w:val="left" w:pos="841"/>
@@ -736,6 +735,7 @@
       </w:pPr>
       <w:r>
         <w:rPr>
+          <w:rFonts w:ascii="Times New Roman" w:hAnsi="Times New Roman"/>
           <w:b w:val="0"/>
           <w:bCs w:val="0"/>
           <w:sz w:val="24"/>
@@ -775,6 +775,8 @@
       </w:pPr>
       <w:r>
         <w:rPr>
+          <w:rFonts w:ascii="Times New Roman" w:hAnsi="Times New Roman"/>
+          <w:b w:val="0"/>
           <w:color w:val="000000" w:themeColor="text1"/>
           <w:sz w:val="24"/>
           <w:szCs w:val="24"/>
@@ -783,6 +785,8 @@
       </w:r>
       <w:r>
         <w:rPr>
+          <w:rFonts w:ascii="Times New Roman" w:hAnsi="Times New Roman"/>
+          <w:b w:val="0"/>
           <w:color w:val="000000" w:themeColor="text1"/>
           <w:sz w:val="24"/>
           <w:szCs w:val="24"/>
@@ -810,7 +814,6 @@
     </w:p>
     <w:p>
       <w:pPr>
-        <w:pStyle w:val="Heading1"/>
         <w:tabs>
           <w:tab w:val="left" w:pos="840"/>
           <w:tab w:val="left" w:pos="841"/>
@@ -827,6 +830,7 @@
       </w:pPr>
       <w:r>
         <w:rPr>
+          <w:rFonts w:ascii="Times New Roman" w:hAnsi="Times New Roman"/>
           <w:b w:val="0"/>
           <w:bCs w:val="0"/>
           <w:sz w:val="24"/>
@@ -836,6 +840,7 @@
       </w:r>
       <w:r>
         <w:rPr>
+          <w:rFonts w:ascii="Times New Roman" w:hAnsi="Times New Roman"/>
           <w:b w:val="0"/>
           <w:bCs w:val="0"/>
           <w:sz w:val="24"/>
@@ -845,6 +850,7 @@
       </w:r>
       <w:r>
         <w:rPr>
+          <w:rFonts w:ascii="Times New Roman" w:hAnsi="Times New Roman"/>
           <w:b w:val="0"/>
           <w:bCs w:val="0"/>
           <w:sz w:val="24"/>
@@ -854,6 +860,7 @@
       </w:r>
       <w:r>
         <w:rPr>
+          <w:rFonts w:ascii="Times New Roman" w:hAnsi="Times New Roman"/>
           <w:b w:val="0"/>
           <w:bCs w:val="0"/>
           <w:sz w:val="24"/>
@@ -907,7 +914,6 @@
     </w:p>
     <w:p>
       <w:pPr>
-        <w:pStyle w:val="Heading1"/>
         <w:tabs>
           <w:tab w:val="left" w:pos="840"/>
           <w:tab w:val="left" w:pos="841"/>
@@ -925,6 +931,7 @@
       </w:pPr>
       <w:r>
         <w:rPr>
+          <w:rFonts w:ascii="Times New Roman" w:hAnsi="Times New Roman"/>
           <w:b w:val="0"/>
           <w:bCs w:val="0"/>
           <w:color w:val="000000" w:themeColor="text1"/>
@@ -935,6 +942,7 @@
       </w:r>
       <w:r>
         <w:rPr>
+          <w:rFonts w:ascii="Times New Roman" w:hAnsi="Times New Roman"/>
           <w:b w:val="0"/>
           <w:bCs w:val="0"/>
           <w:color w:val="000000" w:themeColor="text1"/>
@@ -946,7 +954,6 @@
     </w:p>
     <w:p>
       <w:pPr>
-        <w:pStyle w:val="Heading1"/>
         <w:tabs>
           <w:tab w:val="left" w:pos="840"/>
           <w:tab w:val="left" w:pos="841"/>
@@ -964,6 +971,7 @@
       </w:pPr>
       <w:r>
         <w:rPr>
+          <w:rFonts w:ascii="Times New Roman" w:hAnsi="Times New Roman"/>
           <w:b w:val="0"/>
           <w:bCs w:val="0"/>
           <w:color w:val="000000" w:themeColor="text1"/>
@@ -1048,7 +1056,6 @@
     </w:p>
     <w:p>
       <w:pPr>
-        <w:pStyle w:val="Heading1"/>
         <w:tabs>
           <w:tab w:val="left" w:pos="840"/>
           <w:tab w:val="left" w:pos="841"/>
@@ -1066,6 +1073,7 @@
       </w:pPr>
       <w:r>
         <w:rPr>
+          <w:rFonts w:ascii="Times New Roman" w:hAnsi="Times New Roman"/>
           <w:b w:val="0"/>
           <w:bCs w:val="0"/>
           <w:color w:val="000000" w:themeColor="text1"/>
@@ -1077,7 +1085,6 @@
     </w:p>
     <w:p>
       <w:pPr>
-        <w:pStyle w:val="Heading1"/>
         <w:tabs>
           <w:tab w:val="left" w:pos="840"/>
           <w:tab w:val="left" w:pos="841"/>
@@ -1095,6 +1102,7 @@
       </w:pPr>
       <w:r>
         <w:rPr>
+          <w:rFonts w:ascii="Times New Roman" w:hAnsi="Times New Roman"/>
           <w:b w:val="0"/>
           <w:bCs w:val="0"/>
           <w:color w:val="000000" w:themeColor="text1"/>

</xml_diff>